<commit_message>
Render pull_request 23b9f75e9e3206e51a8e00aec2f37c481968c852 Humanizer pass on main text (#12) 23b9f75e9e3206e51a8e00aec2f37c481968c852
</commit_message>
<xml_diff>
--- a/pr/38/manuscript.docx
+++ b/pr/38/manuscript.docx
@@ -1943,7 +1943,13 @@
         <w:pStyle w:val="BodyText"/>
       </w:pPr>
       <w:r>
-        <w:t xml:space="preserve">The harder sustainability question is the break-even point for data sharing: curation costs are borne by data generators while reuse benefits accrue elsewhere, and the aggregate gains do not always outweigh those costs.</w:t>
+        <w:t xml:space="preserve">The harder sustainability question is the break-even point for data sharing.</w:t>
+      </w:r>
+      <w:r>
+        <w:t xml:space="preserve"> </w:t>
+      </w:r>
+      <w:r>
+        <w:t xml:space="preserve">Curation costs are borne by data generators while reuse benefits accrue elsewhere — an asymmetry that means aggregate gains can fail to cover aggregate costs even when both are positive.</w:t>
       </w:r>
       <w:r>
         <w:t xml:space="preserve"> </w:t>

</xml_diff>